<commit_message>
Latest changes in Cube documentation & template year update
</commit_message>
<xml_diff>
--- a/2026/Templates/POLICY/ZTERS_POLICY_Final_Template_v1.0.docx
+++ b/2026/Templates/POLICY/ZTERS_POLICY_Final_Template_v1.0.docx
@@ -4955,9 +4955,24 @@
         <w:sz w:val="12"/>
         <w:szCs w:val="12"/>
       </w:rPr>
-      <w:t xml:space="preserve">2025 </w:t>
+      <w:t>202</w:t>
     </w:r>
-    <w:proofErr w:type="spellStart"/>
+    <w:r>
+      <w:rPr>
+        <w:bCs/>
+        <w:sz w:val="12"/>
+        <w:szCs w:val="12"/>
+      </w:rPr>
+      <w:t>6</w:t>
+    </w:r>
+    <w:r>
+      <w:rPr>
+        <w:bCs/>
+        <w:sz w:val="12"/>
+        <w:szCs w:val="12"/>
+      </w:rPr>
+      <w:t xml:space="preserve"> </w:t>
+    </w:r>
     <w:r>
       <w:rPr>
         <w:sz w:val="12"/>
@@ -4965,7 +4980,6 @@
       </w:rPr>
       <w:t>ZTERS</w:t>
     </w:r>
-    <w:proofErr w:type="spellEnd"/>
     <w:r>
       <w:rPr>
         <w:sz w:val="12"/>

</xml_diff>